<commit_message>
Add integrated help and Linux release build
</commit_message>
<xml_diff>
--- a/docs/Manual_Corretor_XML_NFe.docx
+++ b/docs/Manual_Corretor_XML_NFe.docx
@@ -39,7 +39,7 @@
           <w:color w:val="4B5563"/>
           <w:sz w:val="20"/>
         </w:rPr>
-        <w:t xml:space="preserve">Versão recomendada: v0.2.0 | Autor: Eduardo Coutinho da Silva Junior | </w:t>
+        <w:t xml:space="preserve">Versão recomendada: v0.3.0 | Autor: Eduardo Coutinho da Silva Junior | </w:t>
       </w:r>
       <w:hyperlink r:id="rId11">
         <w:r>
@@ -178,6 +178,21 @@
           <w:sz w:val="22"/>
         </w:rPr>
         <w:t>Preserva a estrutura, formatação e namespaces do XML original, alterando apenas as tags selecionadas.</w:t>
+      </w:r>
+    </w:p>
+    <w:p>
+      <w:pPr>
+        <w:pStyle w:val="ListBullet"/>
+        <w:spacing w:before="0" w:after="80" w:line="300" w:lineRule="auto"/>
+        <w:ind w:left="540" w:hanging="271"/>
+      </w:pPr>
+      <w:r>
+        <w:rPr>
+          <w:rFonts w:ascii="Calibri" w:hAnsi="Calibri"/>
+          <w:color w:val="111827"/>
+          <w:sz w:val="22"/>
+        </w:rPr>
+        <w:t>Traz um manual dentro do programa, acessível pelo botão ? no cabeçalho.</w:t>
       </w:r>
     </w:p>
     <w:p>
@@ -511,6 +526,21 @@
           <w:color w:val="111827"/>
           <w:sz w:val="22"/>
         </w:rPr>
+        <w:t>Se tiver dúvida sobre uma opção, clique no botão ? para abrir o manual dentro do programa.</w:t>
+      </w:r>
+    </w:p>
+    <w:p>
+      <w:pPr>
+        <w:pStyle w:val="ListNumber"/>
+        <w:spacing w:before="0" w:after="80" w:line="300" w:lineRule="auto"/>
+        <w:ind w:left="540" w:hanging="271"/>
+      </w:pPr>
+      <w:r>
+        <w:rPr>
+          <w:rFonts w:ascii="Calibri" w:hAnsi="Calibri"/>
+          <w:color w:val="111827"/>
+          <w:sz w:val="22"/>
+        </w:rPr>
         <w:t>Clique em Selecionar e escolha o arquivo XML da nota de entrada.</w:t>
       </w:r>
     </w:p>
@@ -685,6 +715,42 @@
           <w:t>https://github.com/educsj/corretor-de-xml/releases</w:t>
         </w:r>
       </w:hyperlink>
+    </w:p>
+    <w:p>
+      <w:pPr>
+        <w:pStyle w:val="Heading1"/>
+      </w:pPr>
+      <w:r>
+        <w:t>Versão Linux</w:t>
+      </w:r>
+    </w:p>
+    <w:p>
+      <w:pPr/>
+      <w:r>
+        <w:t>No Linux x86_64, extraia o pacote da release. Execute chmod +x CorretorXMLNFe-linux-x86_64 e depois ./CorretorXMLNFe-linux-x86_64.</w:t>
+      </w:r>
+    </w:p>
+    <w:p>
+      <w:pPr>
+        <w:pStyle w:val="Heading1"/>
+      </w:pPr>
+      <w:r>
+        <w:t>Aviso de segurança do Windows</w:t>
+      </w:r>
+    </w:p>
+    <w:p>
+      <w:pPr/>
+      <w:r>
+        <w:t>Como o executável ainda não possui assinatura digital de editor, o Microsoft Defender SmartScreen pode classificá-lo como aplicativo não reconhecido, principalmente após uma atualização.</w:t>
+      </w:r>
+    </w:p>
+    <w:p>
+      <w:pPr>
+        <w:pStyle w:val="ListBullet"/>
+      </w:pPr>
+      <w:r>
+        <w:t>Baixe apenas pela release oficial e confira SHA256SUMS.txt. Não execute arquivos de outra origem. Para versões futuras, assinatura digital consistente ou Microsoft Store são as mitigações recomendadas.</w:t>
+      </w:r>
     </w:p>
     <w:sectPr>
       <w:headerReference w:type="default" r:id="rId9"/>

</xml_diff>